<commit_message>
Add Group 1 roster, course and instructor to deliverables
Title page of the report and the deck's title slide now carry
Application Security Methodology, Group 1 (Abdul-Ramon Adeyemi Folarin,
Immanuel Guarin, Sherman Law, Suranjit Paul) and Instructor Mark Shtern,
plus a note that bug reports and videos are individual submissions.

Co-authored-by: Adeyemi Folarin <devzephyr@users.noreply.github.com>
</commit_message>
<xml_diff>
--- a/devsecops/deliverables/DevSecOps_Final_Report.docx
+++ b/devsecops/deliverables/DevSecOps_Final_Report.docx
@@ -24,7 +24,28 @@
         <w:jc w:val="center"/>
       </w:pPr>
       <w:r>
-        <w:t>Author: &lt;your name&gt;   |   Course: &lt;course&gt;   |   Date: &lt;date&gt;</w:t>
+        <w:t>Application Security Methodology  |  August 2026</w:t>
+      </w:r>
+    </w:p>
+    <w:p>
+      <w:pPr>
+        <w:jc w:val="center"/>
+      </w:pPr>
+      <w:r>
+        <w:t>Group 1: Abdul-Ramon Adeyemi Folarin, Immanuel Guarin, Sherman Law, Suranjit Paul</w:t>
+      </w:r>
+    </w:p>
+    <w:p>
+      <w:pPr>
+        <w:jc w:val="center"/>
+      </w:pPr>
+      <w:r>
+        <w:t>Instructor: Mark Shtern</w:t>
+      </w:r>
+    </w:p>
+    <w:p>
+      <w:r>
+        <w:t>Note: bug reports and the video demonstration are individual submissions - each group member documents their own bug and records their own video of the same length.</w:t>
       </w:r>
     </w:p>
     <w:p>

</xml_diff>